<commit_message>
fix(structure): stop reporting captions, titles, and front matter
</commit_message>
<xml_diff>
--- a/tests/fixtures/heading_without_outline.docx
+++ b/tests/fixtures/heading_without_outline.docx
@@ -9,11 +9,26 @@
     </w:p>
     <w:p>
       <w:r>
+        <w:t>正文第一段，用来把假标题推出标题块豁免范围。</w:t>
+      </w:r>
+    </w:p>
+    <w:p>
+      <w:r>
+        <w:t>正文第二段。</w:t>
+      </w:r>
+    </w:p>
+    <w:p>
+      <w:r>
         <w:rPr>
           <w:b/>
           <w:sz w:val="32"/>
         </w:rPr>
         <w:t>看起来像标题的一行</w:t>
+      </w:r>
+    </w:p>
+    <w:p>
+      <w:r>
+        <w:t>假标题之后的正文。</w:t>
       </w:r>
     </w:p>
     <w:sectPr>

</xml_diff>